<commit_message>
PCR-006 corrections (D-001 clause removed as the brief required, the par_table assertion, the §4.1 and §5.4 sentences) and its annex builder; one-sided diavolume NOR (owner); first drafts and fix passes of PCR-004, -007, -008, -009, -010; factual checks of PCR-007 and PCR-008 saved
Co-Authored-By: Claude Opus 5.5 <noreply@anthropic.com>
</commit_message>
<xml_diff>
--- a/pc_package/PCR-006_viral_inactivation.docx
+++ b/pc_package/PCR-006_viral_inactivation.docx
@@ -6945,7 +6945,7 @@
         <w:pStyle w:val="BodyText"/>
       </w:pPr>
       <w:r>
-        <w:t xml:space="preserve">The centre of each design is the midpoint of the ranges studied, at pH 3.6, 120 min and 20 °C. It is the set-point of none of the three factors, because the ranges are not symmetrical about the set-points. The centre points therefore estimate pure error at the design centre, and each model predicts the outputs at the set-point from the fitted surface rather than measuring them there.</w:t>
+        <w:t xml:space="preserve">The centre of each design is the midpoint of the ranges studied, at pH 3.6, 120 min and 20 °C. It lies away from the set-points the studies were run around, pH 3.5, 90 min and 21 °C, because each range reaches further on one side of its set-point. The centre points therefore estimate pure error at the design centre, and each model predicts the outputs at the set-point from the fitted surface rather than measuring them there.</w:t>
       </w:r>
     </w:p>
     <w:bookmarkEnd w:id="47"/>
@@ -15063,7 +15063,18 @@
         <w:pStyle w:val="BodyText"/>
       </w:pPr>
       <w:r>
-        <w:t xml:space="preserve">The acidic variants grow with the hold time and with nothing else, by 0.20 percentage points per 60 min. No effect of pH and no effect of temperature was resolved on them in any study of the step. The acid-catalysed hydrolysis of side-chain amides that</w:t>
+        <w:t xml:space="preserve">The acidic variants grow with the hold time and with nothing else, by 0.20 percentage points per 60 min. No effect of pH and no effect of temperature on them was resolved in the designs. The difference between the two pH values of S-VI-OFAT was already present when the hold began (</w:t>
+      </w:r>
+      <w:hyperlink w:anchor="sec-ofat">
+        <w:r>
+          <w:rPr>
+            <w:rStyle w:val="Hyperlink"/>
+          </w:rPr>
+          <w:t xml:space="preserve">Section 7.5.1</w:t>
+        </w:r>
+      </w:hyperlink>
+      <w:r>
+        <w:t xml:space="preserve">). The acid-catalysed hydrolysis of side-chain amides that</w:t>
       </w:r>
       <w:r>
         <w:t xml:space="preserve"> </w:t>
@@ -15121,7 +15132,18 @@
         </w:r>
       </w:hyperlink>
       <w:r>
-        <w:t xml:space="preserve">). No effect of pH and no effect of temperature on fragments was resolved in any study.</w:t>
+        <w:t xml:space="preserve">). Fragments have no adequate model, and S-VI-OFAT found no effect of pH on them at the two pH values it compared (</w:t>
+      </w:r>
+      <w:hyperlink w:anchor="sec-ofat">
+        <w:r>
+          <w:rPr>
+            <w:rStyle w:val="Hyperlink"/>
+          </w:rPr>
+          <w:t xml:space="preserve">Section 7.5.1</w:t>
+        </w:r>
+      </w:hyperlink>
+      <w:r>
+        <w:t xml:space="preserve">).</w:t>
       </w:r>
     </w:p>
     <w:bookmarkEnd w:id="84"/>
@@ -16175,13 +16197,19 @@
                     <w:jc w:val="center"/>
                   </w:pPr>
                   <w:r>
-                    <w:t xml:space="preserve">Mean predicted by the response-surface model,</w:t>
+                    <w:t xml:space="preserve">Mean predicted by the</w:t>
                   </w:r>
                   <w:r>
                     <w:br/>
                   </w:r>
                   <w:r>
-                    <w:t xml:space="preserve">or measured results where it has none</w:t>
+                    <w:t xml:space="preserve">response-surface model, or measured</w:t>
+                  </w:r>
+                  <w:r>
+                    <w:br/>
+                  </w:r>
+                  <w:r>
+                    <w:t xml:space="preserve">results where it has none</w:t>
                   </w:r>
                   <w:r>
                     <w:rPr>
@@ -17797,7 +17825,7 @@
         <w:t xml:space="preserve"> </w:t>
       </w:r>
       <w:r>
-        <w:t xml:space="preserve">gives the PAR of each factor for XMuLV clearance, as PCMP-001 §6.4 defines the two analyses. The first analysis scans the factor across its range studied with the other two at their set-points and compares the mean prediction with the criterion. The second varies the other two within their NORs, as</w:t>
+        <w:t xml:space="preserve">gives the PAR of each factor for XMuLV clearance, as PCMP-001 §6.4 defines the two analyses. The first analysis scans the factor across its range studied and compares the mean prediction with the criterion. The second varies the other two within their NORs, as</w:t>
       </w:r>
       <w:r>
         <w:t xml:space="preserve"> </w:t>
@@ -29430,7 +29458,7 @@
                     <w:jc w:val="center"/>
                   </w:pPr>
                   <w:r>
-                    <w:t xml:space="preserve">the neutralized pool held at two temperatures for seven days, aggregate by SEC, acidic variants by icIEF and fragments by nrCE-SDS at every time point (study S-VI-HLD); the report states how a held pool is judged, an approach no plan set, chosen after the results were known</w:t>
+                    <w:t xml:space="preserve">the neutralized pool held at two temperatures for seven days, aggregate by SEC, acidic variants by icIEF and fragments by nrCE-SDS at every time point (study S-VI-HLD); the pool is judged against the criteria it must meet on entering the next step (PCMP-001 Version 2.0 §5), and the level expected to enter the hold and the reading of the change over it are the report’s approach, chosen after the results were known</w:t>
                   </w:r>
                 </w:p>
               </w:tc>

</xml_diff>